<commit_message>
Lecture 13, 14 until polymorphism
</commit_message>
<xml_diff>
--- a/src/lecture10_MiscTopics/Lecture10_MiscTopics - copy constructor, deep vs shallow copy, composition vs aggregation, String immutability, toString and equals.docx
+++ b/src/lecture10_MiscTopics/Lecture10_MiscTopics - copy constructor, deep vs shallow copy, composition vs aggregation, String immutability, toString and equals.docx
@@ -1900,6 +1900,83 @@
           <w:color w:val="005078"/>
           <w:sz w:val="18"/>
         </w:rPr>
+        <w:br/>
+        <w:t>String modified = greeting.concat(", Pakistan!");</w:t>
+      </w:r>
+      <w:r>
+        <w:rPr>
+          <w:rFonts w:ascii="Consolas" w:hAnsi="Consolas"/>
+          <w:color w:val="005078"/>
+          <w:sz w:val="18"/>
+        </w:rPr>
+        <w:br/>
+      </w:r>
+      <w:r>
+        <w:rPr>
+          <w:rFonts w:ascii="Consolas" w:hAnsi="Consolas"/>
+          <w:color w:val="005078"/>
+          <w:sz w:val="18"/>
+        </w:rPr>
+        <w:br/>
+        <w:t>System.out.println(greeting);   // "Assalam o Alaikum"       — unchanged!</w:t>
+      </w:r>
+      <w:r>
+        <w:rPr>
+          <w:rFonts w:ascii="Consolas" w:hAnsi="Consolas"/>
+          <w:color w:val="005078"/>
+          <w:sz w:val="18"/>
+        </w:rPr>
+        <w:br/>
+        <w:t>System.out.println(modified);   // "Assalam o Alaikum, Pakistan!"  — new String</w:t>
+      </w:r>
+    </w:p>
+    <w:p>
+      <w:pPr>
+        <w:spacing w:before="80" w:after="80"/>
+        <w:ind w:left="432"/>
+        <w:rPr>
+          <w:rFonts w:ascii="Consolas" w:hAnsi="Consolas"/>
+          <w:color w:val="005078"/>
+          <w:sz w:val="18"/>
+        </w:rPr>
+      </w:pPr>
+    </w:p>
+    <w:p>
+      <w:pPr>
+        <w:spacing w:before="80" w:after="80"/>
+        <w:ind w:left="432"/>
+        <w:rPr>
+          <w:rFonts w:ascii="Consolas" w:hAnsi="Consolas"/>
+          <w:color w:val="005078"/>
+          <w:sz w:val="18"/>
+        </w:rPr>
+      </w:pPr>
+      <w:r>
+        <w:rPr>
+          <w:rFonts w:ascii="Consolas" w:hAnsi="Consolas"/>
+          <w:color w:val="005078"/>
+          <w:sz w:val="18"/>
+        </w:rPr>
+        <w:t xml:space="preserve">greeting[0] = ‘a’; // Error </w:t>
+      </w:r>
+    </w:p>
+    <w:p>
+      <w:pPr>
+        <w:spacing w:before="80" w:after="80"/>
+        <w:ind w:left="432"/>
+        <w:rPr>
+          <w:rFonts w:ascii="Consolas" w:hAnsi="Consolas"/>
+          <w:color w:val="005078"/>
+          <w:sz w:val="18"/>
+        </w:rPr>
+      </w:pPr>
+      <w:r>
+        <w:rPr>
+          <w:rFonts w:ascii="Consolas" w:hAnsi="Consolas"/>
+          <w:color w:val="005078"/>
+          <w:sz w:val="18"/>
+        </w:rPr>
+        <w:lastRenderedPageBreak/>
         <w:t>greeting = greeting + “abc”;</w:t>
       </w:r>
     </w:p>
@@ -1908,61 +1985,9 @@
         <w:spacing w:before="80" w:after="80"/>
         <w:ind w:left="432"/>
       </w:pPr>
-      <w:r>
-        <w:rPr>
-          <w:rFonts w:ascii="Consolas" w:hAnsi="Consolas"/>
-          <w:color w:val="005078"/>
-          <w:sz w:val="18"/>
-        </w:rPr>
-        <w:t>greeting[0] = ‘G’;</w:t>
-      </w:r>
-      <w:r>
-        <w:rPr>
-          <w:rFonts w:ascii="Consolas" w:hAnsi="Consolas"/>
-          <w:color w:val="005078"/>
-          <w:sz w:val="18"/>
-        </w:rPr>
-        <w:t xml:space="preserve"> // Error</w:t>
-      </w:r>
-      <w:r>
-        <w:rPr>
-          <w:rFonts w:ascii="Consolas" w:hAnsi="Consolas"/>
-          <w:color w:val="005078"/>
-          <w:sz w:val="18"/>
-        </w:rPr>
-        <w:br/>
-        <w:t>String modified = greeting.concat(", Pakistan!");</w:t>
-      </w:r>
-      <w:r>
-        <w:rPr>
-          <w:rFonts w:ascii="Consolas" w:hAnsi="Consolas"/>
-          <w:color w:val="005078"/>
-          <w:sz w:val="18"/>
-        </w:rPr>
-        <w:br/>
-      </w:r>
-      <w:r>
-        <w:rPr>
-          <w:rFonts w:ascii="Consolas" w:hAnsi="Consolas"/>
-          <w:color w:val="005078"/>
-          <w:sz w:val="18"/>
-        </w:rPr>
-        <w:br/>
-        <w:t>System.out.println(greeting);   // "Assalam o Alaikum"       — unchanged!</w:t>
-      </w:r>
-      <w:r>
-        <w:rPr>
-          <w:rFonts w:ascii="Consolas" w:hAnsi="Consolas"/>
-          <w:color w:val="005078"/>
-          <w:sz w:val="18"/>
-        </w:rPr>
-        <w:br/>
-        <w:t>System.out.println(modified);   // "Assalam o Alaikum, Pakistan!"  — new String</w:t>
-      </w:r>
     </w:p>
     <w:p>
       <w:r>
-        <w:lastRenderedPageBreak/>
         <w:t>Every String method that appears to "modify" the string actually returns a new String object. The original remains untouched.</w:t>
       </w:r>
     </w:p>
@@ -2111,6 +2136,10 @@
     <w:p>
       <w:pPr>
         <w:pStyle w:val="ListNumber"/>
+        <w:numPr>
+          <w:ilvl w:val="0"/>
+          <w:numId w:val="10"/>
+        </w:numPr>
       </w:pPr>
       <w:r>
         <w:t>System.out.println(carObject) — prints the result of toString()</w:t>
@@ -2951,6 +2980,12 @@
   </w:num>
   <w:num w:numId="9" w16cid:durableId="678388183">
     <w:abstractNumId w:val="0"/>
+  </w:num>
+  <w:num w:numId="10" w16cid:durableId="1501123069">
+    <w:abstractNumId w:val="7"/>
+    <w:lvlOverride w:ilvl="0">
+      <w:startOverride w:val="1"/>
+    </w:lvlOverride>
   </w:num>
 </w:numbering>
 </file>

</xml_diff>